<commit_message>
Evolui branding e restaura histórico Lumiar
</commit_message>
<xml_diff>
--- a/assets/Enzo-Marinho-Curriculo-ATS.docx
+++ b/assets/Enzo-Marinho-Curriculo-ATS.docx
@@ -10,7 +10,7 @@
         <w:rPr>
           <w:rFonts w:ascii="Calibri" w:hAnsi="Calibri"/>
           <w:b/>
-          <w:color w:val="121018"/>
+          <w:color w:val="0F0C14"/>
           <w:sz w:val="44"/>
         </w:rPr>
         <w:t>ENZO MARINHO</w:t>
@@ -20,14 +20,14 @@
       <w:pPr>
         <w:spacing w:after="100"/>
         <w:pBdr>
-          <w:bottom w:val="single" w:sz="12" w:space="5" w:color="8B5CF6"/>
+          <w:bottom w:val="single" w:sz="12" w:space="5" w:color="7C3AED"/>
         </w:pBdr>
       </w:pPr>
       <w:r>
         <w:rPr>
           <w:rFonts w:ascii="Calibri" w:hAnsi="Calibri"/>
           <w:b/>
-          <w:color w:val="121018"/>
+          <w:color w:val="0F0C14"/>
           <w:sz w:val="21"/>
         </w:rPr>
         <w:t>Estrategista de Conteúdo | Produção Audiovisual | Edição de Vídeo</w:t>
@@ -52,14 +52,14 @@
         <w:keepNext/>
         <w:spacing w:before="160" w:after="100"/>
         <w:pBdr>
-          <w:bottom w:val="single" w:sz="8" w:space="5" w:color="8B5CF6"/>
+          <w:bottom w:val="single" w:sz="8" w:space="5" w:color="7C3AED"/>
         </w:pBdr>
       </w:pPr>
       <w:r>
         <w:rPr>
           <w:rFonts w:ascii="Calibri" w:hAnsi="Calibri"/>
           <w:b/>
-          <w:color w:val="121018"/>
+          <w:color w:val="0F0C14"/>
           <w:sz w:val="20"/>
         </w:rPr>
         <w:t>RESUMO PROFISSIONAL</w:t>
@@ -78,14 +78,14 @@
         <w:keepNext/>
         <w:spacing w:before="160" w:after="100"/>
         <w:pBdr>
-          <w:bottom w:val="single" w:sz="8" w:space="5" w:color="8B5CF6"/>
+          <w:bottom w:val="single" w:sz="8" w:space="5" w:color="7C3AED"/>
         </w:pBdr>
       </w:pPr>
       <w:r>
         <w:rPr>
           <w:rFonts w:ascii="Calibri" w:hAnsi="Calibri"/>
           <w:b/>
-          <w:color w:val="121018"/>
+          <w:color w:val="0F0C14"/>
           <w:sz w:val="20"/>
         </w:rPr>
         <w:t>EXPERIÊNCIA</w:t>
@@ -100,7 +100,7 @@
         <w:rPr>
           <w:rFonts w:ascii="Calibri" w:hAnsi="Calibri"/>
           <w:b/>
-          <w:color w:val="121018"/>
+          <w:color w:val="0F0C14"/>
           <w:sz w:val="21"/>
         </w:rPr>
         <w:t>VOTI Software</w:t>
@@ -132,7 +132,7 @@
       <w:r>
         <w:rPr>
           <w:rFonts w:ascii="Calibri" w:hAnsi="Calibri"/>
-          <w:color w:val="121018"/>
+          <w:color w:val="0F0C14"/>
           <w:sz w:val="19"/>
         </w:rPr>
         <w:t>Planejamento e produção de conteúdo para YouTube, Instagram, TikTok e LinkedIn, do roteiro à publicação.</w:t>
@@ -147,7 +147,7 @@
       <w:r>
         <w:rPr>
           <w:rFonts w:ascii="Calibri" w:hAnsi="Calibri"/>
-          <w:color w:val="121018"/>
+          <w:color w:val="0F0C14"/>
           <w:sz w:val="19"/>
         </w:rPr>
         <w:t>Direção, captação e edição de vídeos institucionais, educacionais, promocionais e de bastidores.</w:t>
@@ -162,7 +162,7 @@
       <w:r>
         <w:rPr>
           <w:rFonts w:ascii="Calibri" w:hAnsi="Calibri"/>
-          <w:color w:val="121018"/>
+          <w:color w:val="0F0C14"/>
           <w:sz w:val="19"/>
         </w:rPr>
         <w:t>Tradução de temas técnicos de software e ERP em narrativas acessíveis para públicos não técnicos.</w:t>
@@ -177,7 +177,7 @@
       <w:r>
         <w:rPr>
           <w:rFonts w:ascii="Calibri" w:hAnsi="Calibri"/>
-          <w:color w:val="121018"/>
+          <w:color w:val="0F0C14"/>
           <w:sz w:val="19"/>
         </w:rPr>
         <w:t>Criação de cortes verticais, campanhas e peças de produto, com acompanhamento de métricas e ajustes contínuos.</w:t>
@@ -192,7 +192,7 @@
         <w:rPr>
           <w:rFonts w:ascii="Calibri" w:hAnsi="Calibri"/>
           <w:b/>
-          <w:color w:val="121018"/>
+          <w:color w:val="0F0C14"/>
           <w:sz w:val="21"/>
         </w:rPr>
         <w:t>Projetos independentes</w:t>
@@ -224,7 +224,7 @@
       <w:r>
         <w:rPr>
           <w:rFonts w:ascii="Calibri" w:hAnsi="Calibri"/>
-          <w:color w:val="121018"/>
+          <w:color w:val="0F0C14"/>
           <w:sz w:val="19"/>
         </w:rPr>
         <w:t>Negócio Sem Filtro: edição do vídeo longo, de todos os cortes e teasers publicados, com seleção e ranking de trechos apoiados por IA.</w:t>
@@ -239,7 +239,7 @@
       <w:r>
         <w:rPr>
           <w:rFonts w:ascii="Calibri" w:hAnsi="Calibri"/>
-          <w:color w:val="121018"/>
+          <w:color w:val="0F0C14"/>
           <w:sz w:val="19"/>
         </w:rPr>
         <w:t>Kayky Pitondo: estruturação e edição de conteúdo longo, correção de cor e adaptação para cortes verticais.</w:t>
@@ -254,7 +254,7 @@
       <w:r>
         <w:rPr>
           <w:rFonts w:ascii="Calibri" w:hAnsi="Calibri"/>
-          <w:color w:val="121018"/>
+          <w:color w:val="0F0C14"/>
           <w:sz w:val="19"/>
         </w:rPr>
         <w:t>Magnos Steel: produção de vídeos promocionais e de produto para varejo.</w:t>
@@ -269,7 +269,7 @@
       <w:r>
         <w:rPr>
           <w:rFonts w:ascii="Calibri" w:hAnsi="Calibri"/>
-          <w:color w:val="121018"/>
+          <w:color w:val="0F0C14"/>
           <w:sz w:val="19"/>
         </w:rPr>
         <w:t>8848 Jiu-Jitsu: captação e edição de peça audiovisual para redes sociais em projeto pontual.</w:t>
@@ -277,17 +277,32 @@
     </w:p>
     <w:p>
       <w:pPr>
+        <w:pStyle w:val="ListBullet"/>
+        <w:spacing w:after="60" w:line="252" w:lineRule="auto"/>
+        <w:ind w:left="317" w:hanging="230"/>
+      </w:pPr>
+      <w:r>
+        <w:rPr>
+          <w:rFonts w:ascii="Calibri" w:hAnsi="Calibri"/>
+          <w:color w:val="0F0C14"/>
+          <w:sz w:val="19"/>
+        </w:rPr>
+        <w:t>Lumiar Parfum (projeto encerrado): direção e edição de anúncios, esquetes e peças de revenda para perfumaria.</w:t>
+      </w:r>
+    </w:p>
+    <w:p>
+      <w:pPr>
         <w:keepNext/>
         <w:spacing w:before="160" w:after="100"/>
         <w:pBdr>
-          <w:bottom w:val="single" w:sz="8" w:space="5" w:color="8B5CF6"/>
+          <w:bottom w:val="single" w:sz="8" w:space="5" w:color="7C3AED"/>
         </w:pBdr>
       </w:pPr>
       <w:r>
         <w:rPr>
           <w:rFonts w:ascii="Calibri" w:hAnsi="Calibri"/>
           <w:b/>
-          <w:color w:val="121018"/>
+          <w:color w:val="0F0C14"/>
           <w:sz w:val="20"/>
         </w:rPr>
         <w:t>COMPETÊNCIAS</w:t>
@@ -301,7 +316,7 @@
         <w:rPr>
           <w:rFonts w:ascii="Calibri" w:hAnsi="Calibri"/>
           <w:b/>
-          <w:color w:val="121018"/>
+          <w:color w:val="0F0C14"/>
           <w:sz w:val="19"/>
         </w:rPr>
         <w:t xml:space="preserve">Estratégia e conteúdo: </w:t>
@@ -309,7 +324,7 @@
       <w:r>
         <w:rPr>
           <w:rFonts w:ascii="Calibri" w:hAnsi="Calibri"/>
-          <w:color w:val="121018"/>
+          <w:color w:val="0F0C14"/>
           <w:sz w:val="19"/>
         </w:rPr>
         <w:t>Storytelling, copywriting, roteirização, SEO para YouTube, análise de métricas</w:t>
@@ -323,7 +338,7 @@
         <w:rPr>
           <w:rFonts w:ascii="Calibri" w:hAnsi="Calibri"/>
           <w:b/>
-          <w:color w:val="121018"/>
+          <w:color w:val="0F0C14"/>
           <w:sz w:val="19"/>
         </w:rPr>
         <w:t xml:space="preserve">Produção audiovisual: </w:t>
@@ -331,7 +346,7 @@
       <w:r>
         <w:rPr>
           <w:rFonts w:ascii="Calibri" w:hAnsi="Calibri"/>
-          <w:color w:val="121018"/>
+          <w:color w:val="0F0C14"/>
           <w:sz w:val="19"/>
         </w:rPr>
         <w:t>Direção, captação, gimbal, iluminação e captação de áudio</w:t>
@@ -345,7 +360,7 @@
         <w:rPr>
           <w:rFonts w:ascii="Calibri" w:hAnsi="Calibri"/>
           <w:b/>
-          <w:color w:val="121018"/>
+          <w:color w:val="0F0C14"/>
           <w:sz w:val="19"/>
         </w:rPr>
         <w:t xml:space="preserve">Pós-produção: </w:t>
@@ -353,7 +368,7 @@
       <w:r>
         <w:rPr>
           <w:rFonts w:ascii="Calibri" w:hAnsi="Calibri"/>
-          <w:color w:val="121018"/>
+          <w:color w:val="0F0C14"/>
           <w:sz w:val="19"/>
         </w:rPr>
         <w:t>DaVinci Resolve, Adobe Premiere Pro, CapCut, color grading e design de som</w:t>
@@ -367,7 +382,7 @@
         <w:rPr>
           <w:rFonts w:ascii="Calibri" w:hAnsi="Calibri"/>
           <w:b/>
-          <w:color w:val="121018"/>
+          <w:color w:val="0F0C14"/>
           <w:sz w:val="19"/>
         </w:rPr>
         <w:t xml:space="preserve">IA e automação: </w:t>
@@ -375,7 +390,7 @@
       <w:r>
         <w:rPr>
           <w:rFonts w:ascii="Calibri" w:hAnsi="Calibri"/>
-          <w:color w:val="121018"/>
+          <w:color w:val="0F0C14"/>
           <w:sz w:val="19"/>
         </w:rPr>
         <w:t>Remotion, ffmpeg, transcrição, seleção de cortes e vídeo programático</w:t>
@@ -386,14 +401,14 @@
         <w:keepNext/>
         <w:spacing w:before="160" w:after="100"/>
         <w:pBdr>
-          <w:bottom w:val="single" w:sz="8" w:space="5" w:color="8B5CF6"/>
+          <w:bottom w:val="single" w:sz="8" w:space="5" w:color="7C3AED"/>
         </w:pBdr>
       </w:pPr>
       <w:r>
         <w:rPr>
           <w:rFonts w:ascii="Calibri" w:hAnsi="Calibri"/>
           <w:b/>
-          <w:color w:val="121018"/>
+          <w:color w:val="0F0C14"/>
           <w:sz w:val="20"/>
         </w:rPr>
         <w:t>FORMAÇÃO</w:t>
@@ -407,7 +422,7 @@
         <w:rPr>
           <w:rFonts w:ascii="Calibri" w:hAnsi="Calibri"/>
           <w:b/>
-          <w:color w:val="121018"/>
+          <w:color w:val="0F0C14"/>
           <w:sz w:val="20"/>
         </w:rPr>
         <w:t>Publicidade e Propaganda</w:t>
@@ -426,14 +441,14 @@
         <w:keepNext/>
         <w:spacing w:before="160" w:after="100"/>
         <w:pBdr>
-          <w:bottom w:val="single" w:sz="8" w:space="5" w:color="8B5CF6"/>
+          <w:bottom w:val="single" w:sz="8" w:space="5" w:color="7C3AED"/>
         </w:pBdr>
       </w:pPr>
       <w:r>
         <w:rPr>
           <w:rFonts w:ascii="Calibri" w:hAnsi="Calibri"/>
           <w:b/>
-          <w:color w:val="121018"/>
+          <w:color w:val="0F0C14"/>
           <w:sz w:val="20"/>
         </w:rPr>
         <w:t>PORTFÓLIO SELECIONADO</w:t>
@@ -443,7 +458,7 @@
       <w:r>
         <w:rPr>
           <w:rFonts w:ascii="Calibri" w:hAnsi="Calibri"/>
-          <w:color w:val="121018"/>
+          <w:color w:val="0F0C14"/>
           <w:sz w:val="18"/>
         </w:rPr>
         <w:t>Portfólio geral: enzosmarinho.github.io | VOTI Software: youtube.com/@votigestao | Negócio Sem Filtro: instagram.com/onegociosemfiltro</w:t>
@@ -847,7 +862,7 @@
     </w:pPr>
     <w:rPr>
       <w:rFonts w:ascii="Calibri" w:hAnsi="Calibri"/>
-      <w:color w:val="121018"/>
+      <w:color w:val="0F0C14"/>
       <w:sz w:val="21"/>
     </w:rPr>
   </w:style>
@@ -913,7 +928,7 @@
       <w:rFonts w:asciiTheme="majorHAnsi" w:eastAsiaTheme="majorEastAsia" w:hAnsiTheme="majorHAnsi" w:cstheme="majorBidi" w:ascii="Calibri" w:hAnsi="Calibri"/>
       <w:b/>
       <w:bCs/>
-      <w:color w:val="121018"/>
+      <w:color w:val="0F0C14"/>
       <w:sz w:val="32"/>
       <w:szCs w:val="28"/>
     </w:rPr>
@@ -937,7 +952,7 @@
       <w:rFonts w:asciiTheme="majorHAnsi" w:eastAsiaTheme="majorEastAsia" w:hAnsiTheme="majorHAnsi" w:cstheme="majorBidi" w:ascii="Calibri" w:hAnsi="Calibri"/>
       <w:b/>
       <w:bCs/>
-      <w:color w:val="121018"/>
+      <w:color w:val="0F0C14"/>
       <w:sz w:val="26"/>
       <w:szCs w:val="26"/>
     </w:rPr>
@@ -961,7 +976,7 @@
       <w:rFonts w:asciiTheme="majorHAnsi" w:eastAsiaTheme="majorEastAsia" w:hAnsiTheme="majorHAnsi" w:cstheme="majorBidi" w:ascii="Calibri" w:hAnsi="Calibri"/>
       <w:b/>
       <w:bCs/>
-      <w:color w:val="121018"/>
+      <w:color w:val="0F0C14"/>
       <w:sz w:val="24"/>
     </w:rPr>
   </w:style>

</xml_diff>

<commit_message>
Finaliza portfolio com identidade original e foto sincronizada
</commit_message>
<xml_diff>
--- a/assets/Enzo-Marinho-Curriculo-ATS.docx
+++ b/assets/Enzo-Marinho-Curriculo-ATS.docx
@@ -20,7 +20,7 @@
       <w:pPr>
         <w:spacing w:after="100"/>
         <w:pBdr>
-          <w:bottom w:val="single" w:sz="12" w:space="5" w:color="7C3AED"/>
+          <w:bottom w:val="single" w:sz="12" w:space="5" w:color="FF4D35"/>
         </w:pBdr>
       </w:pPr>
       <w:r>
@@ -52,7 +52,7 @@
         <w:keepNext/>
         <w:spacing w:before="160" w:after="100"/>
         <w:pBdr>
-          <w:bottom w:val="single" w:sz="8" w:space="5" w:color="7C3AED"/>
+          <w:bottom w:val="single" w:sz="8" w:space="5" w:color="FF4D35"/>
         </w:pBdr>
       </w:pPr>
       <w:r>
@@ -78,7 +78,7 @@
         <w:keepNext/>
         <w:spacing w:before="160" w:after="100"/>
         <w:pBdr>
-          <w:bottom w:val="single" w:sz="8" w:space="5" w:color="7C3AED"/>
+          <w:bottom w:val="single" w:sz="8" w:space="5" w:color="FF4D35"/>
         </w:pBdr>
       </w:pPr>
       <w:r>
@@ -295,7 +295,7 @@
         <w:keepNext/>
         <w:spacing w:before="160" w:after="100"/>
         <w:pBdr>
-          <w:bottom w:val="single" w:sz="8" w:space="5" w:color="7C3AED"/>
+          <w:bottom w:val="single" w:sz="8" w:space="5" w:color="FF4D35"/>
         </w:pBdr>
       </w:pPr>
       <w:r>
@@ -401,7 +401,7 @@
         <w:keepNext/>
         <w:spacing w:before="160" w:after="100"/>
         <w:pBdr>
-          <w:bottom w:val="single" w:sz="8" w:space="5" w:color="7C3AED"/>
+          <w:bottom w:val="single" w:sz="8" w:space="5" w:color="FF4D35"/>
         </w:pBdr>
       </w:pPr>
       <w:r>
@@ -441,7 +441,7 @@
         <w:keepNext/>
         <w:spacing w:before="160" w:after="100"/>
         <w:pBdr>
-          <w:bottom w:val="single" w:sz="8" w:space="5" w:color="7C3AED"/>
+          <w:bottom w:val="single" w:sz="8" w:space="5" w:color="FF4D35"/>
         </w:pBdr>
       </w:pPr>
       <w:r>

</xml_diff>

<commit_message>
Transforma portfolio em vitrine comercial premium
</commit_message>
<xml_diff>
--- a/assets/Enzo-Marinho-Curriculo-ATS.docx
+++ b/assets/Enzo-Marinho-Curriculo-ATS.docx
@@ -4,308 +4,30 @@
   <w:body>
     <w:p>
       <w:pPr>
-        <w:spacing w:after="40"/>
+        <w:spacing w:after="0"/>
       </w:pPr>
       <w:r>
         <w:rPr>
-          <w:rFonts w:ascii="Calibri" w:hAnsi="Calibri"/>
+          <w:rFonts w:ascii="Arial" w:hAnsi="Arial" w:eastAsia="Arial"/>
           <w:b/>
-          <w:color w:val="0F0C14"/>
-          <w:sz w:val="44"/>
+          <w:color w:val="0B0B0B"/>
+          <w:sz w:val="46"/>
         </w:rPr>
         <w:t>ENZO MARINHO</w:t>
       </w:r>
     </w:p>
     <w:p>
       <w:pPr>
-        <w:spacing w:after="100"/>
-        <w:pBdr>
-          <w:bottom w:val="single" w:sz="12" w:space="5" w:color="FF4D35"/>
-        </w:pBdr>
+        <w:spacing w:after="40"/>
       </w:pPr>
       <w:r>
         <w:rPr>
-          <w:rFonts w:ascii="Calibri" w:hAnsi="Calibri"/>
+          <w:rFonts w:ascii="Arial" w:hAnsi="Arial" w:eastAsia="Arial"/>
           <w:b/>
-          <w:color w:val="0F0C14"/>
-          <w:sz w:val="21"/>
-        </w:rPr>
-        <w:t>Estrategista de Conteúdo | Produção Audiovisual | Edição de Vídeo</w:t>
-      </w:r>
-    </w:p>
-    <w:p>
-      <w:pPr>
-        <w:spacing w:after="200"/>
-        <w:jc w:val="left"/>
-      </w:pPr>
-      <w:r>
-        <w:rPr>
-          <w:rFonts w:ascii="Calibri" w:hAnsi="Calibri"/>
-          <w:color w:val="585462"/>
-          <w:sz w:val="17"/>
-        </w:rPr>
-        <w:t>Araçatuba/SP | (18) 98119-6746 | enzo.marinho@hotmail.com | enzosmarinho.github.io | linkedin.com/in/enzo-marinho-727200320</w:t>
-      </w:r>
-    </w:p>
-    <w:p>
-      <w:pPr>
-        <w:keepNext/>
-        <w:spacing w:before="160" w:after="100"/>
-        <w:pBdr>
-          <w:bottom w:val="single" w:sz="8" w:space="5" w:color="FF4D35"/>
-        </w:pBdr>
-      </w:pPr>
-      <w:r>
-        <w:rPr>
-          <w:rFonts w:ascii="Calibri" w:hAnsi="Calibri"/>
-          <w:b/>
-          <w:color w:val="0F0C14"/>
-          <w:sz w:val="20"/>
-        </w:rPr>
-        <w:t>RESUMO PROFISSIONAL</w:t>
-      </w:r>
-    </w:p>
-    <w:p>
-      <w:pPr>
-        <w:spacing w:after="120"/>
-      </w:pPr>
-      <w:r>
-        <w:t>Estrategista de conteúdo e produtor audiovisual com experiência em planejar, dirigir, captar e editar vídeos para marcas, produtos e profissionais. Atuo do briefing à entrega, com foco em narrativas claras, conteúdo de alta retenção e reaproveitamento inteligente de materiais longos. Uso inteligência artificial e vídeo programático para acelerar pesquisa, transcrição, curadoria e produção sem abrir mão da revisão humana.</w:t>
-      </w:r>
-    </w:p>
-    <w:p>
-      <w:pPr>
-        <w:keepNext/>
-        <w:spacing w:before="160" w:after="100"/>
-        <w:pBdr>
-          <w:bottom w:val="single" w:sz="8" w:space="5" w:color="FF4D35"/>
-        </w:pBdr>
-      </w:pPr>
-      <w:r>
-        <w:rPr>
-          <w:rFonts w:ascii="Calibri" w:hAnsi="Calibri"/>
-          <w:b/>
-          <w:color w:val="0F0C14"/>
-          <w:sz w:val="20"/>
-        </w:rPr>
-        <w:t>EXPERIÊNCIA</w:t>
-      </w:r>
-    </w:p>
-    <w:p>
-      <w:pPr>
-        <w:keepNext/>
-        <w:spacing w:before="100" w:after="40"/>
-      </w:pPr>
-      <w:r>
-        <w:rPr>
-          <w:rFonts w:ascii="Calibri" w:hAnsi="Calibri"/>
-          <w:b/>
-          <w:color w:val="0F0C14"/>
-          <w:sz w:val="21"/>
-        </w:rPr>
-        <w:t>VOTI Software</w:t>
-      </w:r>
-      <w:r>
-        <w:rPr>
-          <w:rFonts w:ascii="Calibri" w:hAnsi="Calibri"/>
-          <w:b/>
-          <w:color w:val="585462"/>
-          <w:sz w:val="20"/>
-        </w:rPr>
-        <w:t xml:space="preserve"> | Estrategista de Conteúdo e Produção Audiovisual</w:t>
-      </w:r>
-      <w:r>
-        <w:rPr>
-          <w:rFonts w:ascii="Calibri" w:hAnsi="Calibri"/>
-          <w:color w:val="585462"/>
-          <w:sz w:val="18"/>
-        </w:rPr>
-        <w:t xml:space="preserve"> | Fev 2025 - Atual</w:t>
-      </w:r>
-    </w:p>
-    <w:p>
-      <w:pPr>
-        <w:pStyle w:val="ListBullet"/>
-        <w:spacing w:after="60" w:line="252" w:lineRule="auto"/>
-        <w:ind w:left="317" w:hanging="230"/>
-      </w:pPr>
-      <w:r>
-        <w:rPr>
-          <w:rFonts w:ascii="Calibri" w:hAnsi="Calibri"/>
-          <w:color w:val="0F0C14"/>
+          <w:color w:val="D93723"/>
           <w:sz w:val="19"/>
         </w:rPr>
-        <w:t>Planejamento e produção de conteúdo para YouTube, Instagram, TikTok e LinkedIn, do roteiro à publicação.</w:t>
-      </w:r>
-    </w:p>
-    <w:p>
-      <w:pPr>
-        <w:pStyle w:val="ListBullet"/>
-        <w:spacing w:after="60" w:line="252" w:lineRule="auto"/>
-        <w:ind w:left="317" w:hanging="230"/>
-      </w:pPr>
-      <w:r>
-        <w:rPr>
-          <w:rFonts w:ascii="Calibri" w:hAnsi="Calibri"/>
-          <w:color w:val="0F0C14"/>
-          <w:sz w:val="19"/>
-        </w:rPr>
-        <w:t>Direção, captação e edição de vídeos institucionais, educacionais, promocionais e de bastidores.</w:t>
-      </w:r>
-    </w:p>
-    <w:p>
-      <w:pPr>
-        <w:pStyle w:val="ListBullet"/>
-        <w:spacing w:after="60" w:line="252" w:lineRule="auto"/>
-        <w:ind w:left="317" w:hanging="230"/>
-      </w:pPr>
-      <w:r>
-        <w:rPr>
-          <w:rFonts w:ascii="Calibri" w:hAnsi="Calibri"/>
-          <w:color w:val="0F0C14"/>
-          <w:sz w:val="19"/>
-        </w:rPr>
-        <w:t>Tradução de temas técnicos de software e ERP em narrativas acessíveis para públicos não técnicos.</w:t>
-      </w:r>
-    </w:p>
-    <w:p>
-      <w:pPr>
-        <w:pStyle w:val="ListBullet"/>
-        <w:spacing w:after="60" w:line="252" w:lineRule="auto"/>
-        <w:ind w:left="317" w:hanging="230"/>
-      </w:pPr>
-      <w:r>
-        <w:rPr>
-          <w:rFonts w:ascii="Calibri" w:hAnsi="Calibri"/>
-          <w:color w:val="0F0C14"/>
-          <w:sz w:val="19"/>
-        </w:rPr>
-        <w:t>Criação de cortes verticais, campanhas e peças de produto, com acompanhamento de métricas e ajustes contínuos.</w:t>
-      </w:r>
-    </w:p>
-    <w:p>
-      <w:pPr>
-        <w:keepNext/>
-        <w:spacing w:before="100" w:after="40"/>
-      </w:pPr>
-      <w:r>
-        <w:rPr>
-          <w:rFonts w:ascii="Calibri" w:hAnsi="Calibri"/>
-          <w:b/>
-          <w:color w:val="0F0C14"/>
-          <w:sz w:val="21"/>
-        </w:rPr>
-        <w:t>Projetos independentes</w:t>
-      </w:r>
-      <w:r>
-        <w:rPr>
-          <w:rFonts w:ascii="Calibri" w:hAnsi="Calibri"/>
-          <w:b/>
-          <w:color w:val="585462"/>
-          <w:sz w:val="20"/>
-        </w:rPr>
-        <w:t xml:space="preserve"> | Produtor Audiovisual, Videomaker e Editor</w:t>
-      </w:r>
-      <w:r>
-        <w:rPr>
-          <w:rFonts w:ascii="Calibri" w:hAnsi="Calibri"/>
-          <w:color w:val="585462"/>
-          <w:sz w:val="18"/>
-        </w:rPr>
-        <w:t xml:space="preserve"> | 2025 - Atual</w:t>
-      </w:r>
-    </w:p>
-    <w:p>
-      <w:pPr>
-        <w:pStyle w:val="ListBullet"/>
-        <w:spacing w:after="60" w:line="252" w:lineRule="auto"/>
-        <w:ind w:left="317" w:hanging="230"/>
-      </w:pPr>
-      <w:r>
-        <w:rPr>
-          <w:rFonts w:ascii="Calibri" w:hAnsi="Calibri"/>
-          <w:color w:val="0F0C14"/>
-          <w:sz w:val="19"/>
-        </w:rPr>
-        <w:t>Negócio Sem Filtro: edição do vídeo longo, de todos os cortes e teasers publicados, com seleção e ranking de trechos apoiados por IA.</w:t>
-      </w:r>
-    </w:p>
-    <w:p>
-      <w:pPr>
-        <w:pStyle w:val="ListBullet"/>
-        <w:spacing w:after="60" w:line="252" w:lineRule="auto"/>
-        <w:ind w:left="317" w:hanging="230"/>
-      </w:pPr>
-      <w:r>
-        <w:rPr>
-          <w:rFonts w:ascii="Calibri" w:hAnsi="Calibri"/>
-          <w:color w:val="0F0C14"/>
-          <w:sz w:val="19"/>
-        </w:rPr>
-        <w:t>Kayky Pitondo: estruturação e edição de conteúdo longo, correção de cor e adaptação para cortes verticais.</w:t>
-      </w:r>
-    </w:p>
-    <w:p>
-      <w:pPr>
-        <w:pStyle w:val="ListBullet"/>
-        <w:spacing w:after="60" w:line="252" w:lineRule="auto"/>
-        <w:ind w:left="317" w:hanging="230"/>
-      </w:pPr>
-      <w:r>
-        <w:rPr>
-          <w:rFonts w:ascii="Calibri" w:hAnsi="Calibri"/>
-          <w:color w:val="0F0C14"/>
-          <w:sz w:val="19"/>
-        </w:rPr>
-        <w:t>Magnos Steel: produção de vídeos promocionais e de produto para varejo.</w:t>
-      </w:r>
-    </w:p>
-    <w:p>
-      <w:pPr>
-        <w:pStyle w:val="ListBullet"/>
-        <w:spacing w:after="60" w:line="252" w:lineRule="auto"/>
-        <w:ind w:left="317" w:hanging="230"/>
-      </w:pPr>
-      <w:r>
-        <w:rPr>
-          <w:rFonts w:ascii="Calibri" w:hAnsi="Calibri"/>
-          <w:color w:val="0F0C14"/>
-          <w:sz w:val="19"/>
-        </w:rPr>
-        <w:t>8848 Jiu-Jitsu: captação e edição de peça audiovisual para redes sociais em projeto pontual.</w:t>
-      </w:r>
-    </w:p>
-    <w:p>
-      <w:pPr>
-        <w:pStyle w:val="ListBullet"/>
-        <w:spacing w:after="60" w:line="252" w:lineRule="auto"/>
-        <w:ind w:left="317" w:hanging="230"/>
-      </w:pPr>
-      <w:r>
-        <w:rPr>
-          <w:rFonts w:ascii="Calibri" w:hAnsi="Calibri"/>
-          <w:color w:val="0F0C14"/>
-          <w:sz w:val="19"/>
-        </w:rPr>
-        <w:t>Lumiar Parfum (projeto encerrado): direção e edição de anúncios, esquetes e peças de revenda para perfumaria.</w:t>
-      </w:r>
-    </w:p>
-    <w:p>
-      <w:pPr>
-        <w:keepNext/>
-        <w:spacing w:before="160" w:after="100"/>
-        <w:pBdr>
-          <w:bottom w:val="single" w:sz="8" w:space="5" w:color="FF4D35"/>
-        </w:pBdr>
-      </w:pPr>
-      <w:r>
-        <w:rPr>
-          <w:rFonts w:ascii="Calibri" w:hAnsi="Calibri"/>
-          <w:b/>
-          <w:color w:val="0F0C14"/>
-          <w:sz w:val="20"/>
-        </w:rPr>
-        <w:t>COMPETÊNCIAS</w:t>
+        <w:t>ESTRATÉGIA DE CONTEÚDO | PRODUÇÃO AUDIOVISUAL | EDIÇÃO DE VÍDEO</w:t>
       </w:r>
     </w:p>
     <w:p>
@@ -314,184 +36,518 @@
       </w:pPr>
       <w:r>
         <w:rPr>
-          <w:rFonts w:ascii="Calibri" w:hAnsi="Calibri"/>
+          <w:rFonts w:ascii="Arial" w:hAnsi="Arial" w:eastAsia="Arial"/>
+          <w:color w:val="0B0B0B"/>
+          <w:sz w:val="17"/>
+        </w:rPr>
+        <w:t xml:space="preserve">Araçatuba/SP | (18) 98119-6746 | enzo.marinho@hotmail.com | </w:t>
+      </w:r>
+      <w:hyperlink r:id="rId9">
+        <w:r>
+          <w:rPr>
+            <w:rFonts w:ascii="Arial" w:hAnsi="Arial"/>
+            <w:color w:val="0B0B0B"/>
+            <w:sz w:val="17"/>
+            <w:u w:val="single"/>
+          </w:rPr>
+          <w:t>Portfólio</w:t>
+        </w:r>
+      </w:hyperlink>
+      <w:r>
+        <w:rPr>
+          <w:rFonts w:ascii="Arial" w:hAnsi="Arial" w:eastAsia="Arial"/>
+          <w:color w:val="0B0B0B"/>
+          <w:sz w:val="17"/>
+        </w:rPr>
+        <w:t xml:space="preserve"> | </w:t>
+      </w:r>
+      <w:hyperlink r:id="rId10">
+        <w:r>
+          <w:rPr>
+            <w:rFonts w:ascii="Arial" w:hAnsi="Arial"/>
+            <w:color w:val="0B0B0B"/>
+            <w:sz w:val="17"/>
+            <w:u w:val="single"/>
+          </w:rPr>
+          <w:t>LinkedIn</w:t>
+        </w:r>
+      </w:hyperlink>
+    </w:p>
+    <w:p>
+      <w:pPr>
+        <w:pStyle w:val="Heading1"/>
+      </w:pPr>
+      <w:r>
+        <w:t>RESUMO PROFISSIONAL</w:t>
+      </w:r>
+    </w:p>
+    <w:p>
+      <w:r>
+        <w:rPr>
+          <w:rFonts w:ascii="Arial" w:hAnsi="Arial" w:eastAsia="Arial"/>
+          <w:color w:val="0B0B0B"/>
+          <w:sz w:val="18"/>
+        </w:rPr>
+        <w:t>Estrategista de conteúdo e produtor audiovisual com experiência em estratégia, roteiro, direção, captação, edição e distribuição para marcas, produtos e profissionais. Atuo do briefing à entrega, transformando temas técnicos e materiais longos em conteúdo claro e publicável. Aplico IA a pesquisa, transcrição, curadoria e automação, com revisão humana de narrativa, imagem, áudio e contexto.</w:t>
+      </w:r>
+    </w:p>
+    <w:p>
+      <w:pPr>
+        <w:pStyle w:val="Heading1"/>
+      </w:pPr>
+      <w:r>
+        <w:t>DESTAQUES PROFISSIONAIS</w:t>
+      </w:r>
+    </w:p>
+    <w:p>
+      <w:pPr>
+        <w:numPr>
+          <w:ilvl w:val="0"/>
+          <w:numId w:val="10"/>
+        </w:numPr>
+        <w:spacing w:after="54" w:line="254" w:lineRule="auto"/>
+      </w:pPr>
+      <w:r>
+        <w:rPr>
+          <w:rFonts w:ascii="Arial" w:hAnsi="Arial" w:eastAsia="Arial"/>
+          <w:color w:val="0B0B0B"/>
+          <w:sz w:val="18"/>
+        </w:rPr>
+        <w:t>VOTI Software: atuação CLT em estratégia de conteúdo e produção audiovisual desde fevereiro de 2025.</w:t>
+      </w:r>
+    </w:p>
+    <w:p>
+      <w:pPr>
+        <w:numPr>
+          <w:ilvl w:val="0"/>
+          <w:numId w:val="10"/>
+        </w:numPr>
+        <w:spacing w:after="54" w:line="254" w:lineRule="auto"/>
+      </w:pPr>
+      <w:r>
+        <w:rPr>
+          <w:rFonts w:ascii="Arial" w:hAnsi="Arial" w:eastAsia="Arial"/>
+          <w:color w:val="0B0B0B"/>
+          <w:sz w:val="18"/>
+        </w:rPr>
+        <w:t>Negócio Sem Filtro: edição do vídeo longo, de todos os cortes e teasers publicados, incluindo seleção e ranking de trechos.</w:t>
+      </w:r>
+    </w:p>
+    <w:p>
+      <w:pPr>
+        <w:numPr>
+          <w:ilvl w:val="0"/>
+          <w:numId w:val="10"/>
+        </w:numPr>
+        <w:spacing w:after="54" w:line="254" w:lineRule="auto"/>
+      </w:pPr>
+      <w:r>
+        <w:rPr>
+          <w:rFonts w:ascii="Arial" w:hAnsi="Arial" w:eastAsia="Arial"/>
+          <w:color w:val="0B0B0B"/>
+          <w:sz w:val="18"/>
+        </w:rPr>
+        <w:t>Campanha sazonal da VOTI com 1.733 visualizações públicas no YouTube, verificada em julho de 2026.</w:t>
+      </w:r>
+    </w:p>
+    <w:p>
+      <w:pPr>
+        <w:pStyle w:val="Heading1"/>
+      </w:pPr>
+      <w:r>
+        <w:t>EXPERIÊNCIA</w:t>
+      </w:r>
+    </w:p>
+    <w:p>
+      <w:pPr>
+        <w:tabs>
+          <w:tab w:pos="9288" w:val="right"/>
+        </w:tabs>
+        <w:spacing w:before="30" w:after="0"/>
+      </w:pPr>
+      <w:r>
+        <w:rPr>
+          <w:rFonts w:ascii="Arial" w:hAnsi="Arial" w:eastAsia="Arial"/>
           <w:b/>
-          <w:color w:val="0F0C14"/>
-          <w:sz w:val="19"/>
+          <w:color w:val="0B0B0B"/>
+          <w:sz w:val="20"/>
+        </w:rPr>
+        <w:t>VOTI Software</w:t>
+      </w:r>
+      <w:r>
+        <w:rPr>
+          <w:rFonts w:ascii="Arial" w:hAnsi="Arial" w:eastAsia="Arial"/>
+          <w:b/>
+          <w:color w:val="666660"/>
+          <w:sz w:val="18"/>
+        </w:rPr>
+        <w:t xml:space="preserve"> | Estrategista de Conteúdo e Produção Audiovisual</w:t>
+      </w:r>
+      <w:r>
+        <w:rPr>
+          <w:rFonts w:ascii="Arial" w:hAnsi="Arial" w:eastAsia="Arial"/>
+          <w:color w:val="D93723"/>
+          <w:sz w:val="17"/>
+        </w:rPr>
+        <w:tab/>
+        <w:t>Fev 2025 - Atual</w:t>
+      </w:r>
+    </w:p>
+    <w:p>
+      <w:pPr>
+        <w:numPr>
+          <w:ilvl w:val="0"/>
+          <w:numId w:val="10"/>
+        </w:numPr>
+        <w:spacing w:after="54" w:line="254" w:lineRule="auto"/>
+      </w:pPr>
+      <w:r>
+        <w:rPr>
+          <w:rFonts w:ascii="Arial" w:hAnsi="Arial" w:eastAsia="Arial"/>
+          <w:color w:val="0B0B0B"/>
+          <w:sz w:val="18"/>
+        </w:rPr>
+        <w:t>Planejamento e produção de conteúdo para YouTube, Instagram, TikTok e LinkedIn, do roteiro à publicação.</w:t>
+      </w:r>
+    </w:p>
+    <w:p>
+      <w:pPr>
+        <w:numPr>
+          <w:ilvl w:val="0"/>
+          <w:numId w:val="10"/>
+        </w:numPr>
+        <w:spacing w:after="54" w:line="254" w:lineRule="auto"/>
+      </w:pPr>
+      <w:r>
+        <w:rPr>
+          <w:rFonts w:ascii="Arial" w:hAnsi="Arial" w:eastAsia="Arial"/>
+          <w:color w:val="0B0B0B"/>
+          <w:sz w:val="18"/>
+        </w:rPr>
+        <w:t>Direção, captação e edição de vídeos institucionais, educacionais, promocionais, de produto e de bastidores.</w:t>
+      </w:r>
+    </w:p>
+    <w:p>
+      <w:pPr>
+        <w:numPr>
+          <w:ilvl w:val="0"/>
+          <w:numId w:val="10"/>
+        </w:numPr>
+        <w:spacing w:after="54" w:line="254" w:lineRule="auto"/>
+      </w:pPr>
+      <w:r>
+        <w:rPr>
+          <w:rFonts w:ascii="Arial" w:hAnsi="Arial" w:eastAsia="Arial"/>
+          <w:color w:val="0B0B0B"/>
+          <w:sz w:val="18"/>
+        </w:rPr>
+        <w:t>Tradução de temas técnicos de software e ERP em narrativas acessíveis para públicos não técnicos.</w:t>
+      </w:r>
+    </w:p>
+    <w:p>
+      <w:pPr>
+        <w:numPr>
+          <w:ilvl w:val="0"/>
+          <w:numId w:val="10"/>
+        </w:numPr>
+        <w:spacing w:after="54" w:line="254" w:lineRule="auto"/>
+      </w:pPr>
+      <w:r>
+        <w:rPr>
+          <w:rFonts w:ascii="Arial" w:hAnsi="Arial" w:eastAsia="Arial"/>
+          <w:color w:val="0B0B0B"/>
+          <w:sz w:val="18"/>
+        </w:rPr>
+        <w:t>Criação de cortes verticais, campanhas e peças de produto, com acompanhamento de métricas e ajustes contínuos.</w:t>
+      </w:r>
+    </w:p>
+    <w:p>
+      <w:pPr>
+        <w:tabs>
+          <w:tab w:pos="9288" w:val="right"/>
+        </w:tabs>
+        <w:spacing w:before="30" w:after="0"/>
+      </w:pPr>
+      <w:r>
+        <w:rPr>
+          <w:rFonts w:ascii="Arial" w:hAnsi="Arial" w:eastAsia="Arial"/>
+          <w:b/>
+          <w:color w:val="0B0B0B"/>
+          <w:sz w:val="20"/>
+        </w:rPr>
+        <w:t>Projetos independentes</w:t>
+      </w:r>
+      <w:r>
+        <w:rPr>
+          <w:rFonts w:ascii="Arial" w:hAnsi="Arial" w:eastAsia="Arial"/>
+          <w:b/>
+          <w:color w:val="666660"/>
+          <w:sz w:val="18"/>
+        </w:rPr>
+        <w:t xml:space="preserve"> | Produtor Audiovisual, Videomaker e Editor</w:t>
+      </w:r>
+      <w:r>
+        <w:rPr>
+          <w:rFonts w:ascii="Arial" w:hAnsi="Arial" w:eastAsia="Arial"/>
+          <w:color w:val="666660"/>
+          <w:sz w:val="17"/>
+        </w:rPr>
+        <w:tab/>
+        <w:t>2025 - Atual</w:t>
+      </w:r>
+    </w:p>
+    <w:p>
+      <w:pPr>
+        <w:numPr>
+          <w:ilvl w:val="0"/>
+          <w:numId w:val="10"/>
+        </w:numPr>
+        <w:spacing w:after="54" w:line="254" w:lineRule="auto"/>
+      </w:pPr>
+      <w:r>
+        <w:rPr>
+          <w:rFonts w:ascii="Arial" w:hAnsi="Arial" w:eastAsia="Arial"/>
+          <w:color w:val="0B0B0B"/>
+          <w:sz w:val="18"/>
+        </w:rPr>
+        <w:t>Negócio Sem Filtro: edição long-form, cortes, teasers e curadoria de trechos apoiada por IA.</w:t>
+      </w:r>
+    </w:p>
+    <w:p>
+      <w:pPr>
+        <w:numPr>
+          <w:ilvl w:val="0"/>
+          <w:numId w:val="10"/>
+        </w:numPr>
+        <w:spacing w:after="54" w:line="254" w:lineRule="auto"/>
+      </w:pPr>
+      <w:r>
+        <w:rPr>
+          <w:rFonts w:ascii="Arial" w:hAnsi="Arial" w:eastAsia="Arial"/>
+          <w:color w:val="0B0B0B"/>
+          <w:sz w:val="18"/>
+        </w:rPr>
+        <w:t>Kayky Pitondo: estruturação e edição de conteúdo long-form, correção de cor e cortes verticais.</w:t>
+      </w:r>
+    </w:p>
+    <w:p>
+      <w:pPr>
+        <w:numPr>
+          <w:ilvl w:val="0"/>
+          <w:numId w:val="10"/>
+        </w:numPr>
+        <w:spacing w:after="54" w:line="254" w:lineRule="auto"/>
+      </w:pPr>
+      <w:r>
+        <w:rPr>
+          <w:rFonts w:ascii="Arial" w:hAnsi="Arial" w:eastAsia="Arial"/>
+          <w:color w:val="0B0B0B"/>
+          <w:sz w:val="18"/>
+        </w:rPr>
+        <w:t>Magnos Steel, 8848 Jiu-Jitsu e Lumiar Parfum (projeto encerrado): anúncios, varejo, captação e conteúdo social.</w:t>
+      </w:r>
+    </w:p>
+    <w:p>
+      <w:pPr>
+        <w:pStyle w:val="Heading1"/>
+      </w:pPr>
+      <w:r>
+        <w:t>COMPETÊNCIAS</w:t>
+      </w:r>
+    </w:p>
+    <w:p>
+      <w:pPr>
+        <w:spacing w:after="44"/>
+      </w:pPr>
+      <w:r>
+        <w:rPr>
+          <w:rFonts w:ascii="Arial" w:hAnsi="Arial" w:eastAsia="Arial"/>
+          <w:b/>
+          <w:color w:val="0B0B0B"/>
+          <w:sz w:val="18"/>
         </w:rPr>
         <w:t xml:space="preserve">Estratégia e conteúdo: </w:t>
       </w:r>
       <w:r>
         <w:rPr>
-          <w:rFonts w:ascii="Calibri" w:hAnsi="Calibri"/>
-          <w:color w:val="0F0C14"/>
-          <w:sz w:val="19"/>
+          <w:rFonts w:ascii="Arial" w:hAnsi="Arial" w:eastAsia="Arial"/>
+          <w:color w:val="0B0B0B"/>
+          <w:sz w:val="18"/>
         </w:rPr>
-        <w:t>Storytelling, copywriting, roteirização, SEO para YouTube, análise de métricas</w:t>
+        <w:t>storytelling, copywriting, roteirização, SEO para YouTube, análise de métricas</w:t>
       </w:r>
     </w:p>
     <w:p>
       <w:pPr>
-        <w:spacing w:after="80"/>
+        <w:spacing w:after="44"/>
       </w:pPr>
       <w:r>
         <w:rPr>
-          <w:rFonts w:ascii="Calibri" w:hAnsi="Calibri"/>
+          <w:rFonts w:ascii="Arial" w:hAnsi="Arial" w:eastAsia="Arial"/>
           <w:b/>
-          <w:color w:val="0F0C14"/>
-          <w:sz w:val="19"/>
+          <w:color w:val="0B0B0B"/>
+          <w:sz w:val="18"/>
         </w:rPr>
         <w:t xml:space="preserve">Produção audiovisual: </w:t>
       </w:r>
       <w:r>
         <w:rPr>
-          <w:rFonts w:ascii="Calibri" w:hAnsi="Calibri"/>
-          <w:color w:val="0F0C14"/>
-          <w:sz w:val="19"/>
+          <w:rFonts w:ascii="Arial" w:hAnsi="Arial" w:eastAsia="Arial"/>
+          <w:color w:val="0B0B0B"/>
+          <w:sz w:val="18"/>
         </w:rPr>
-        <w:t>Direção, captação, gimbal, iluminação e captação de áudio</w:t>
+        <w:t>direção, captação, gimbal, iluminação, captação de áudio</w:t>
       </w:r>
     </w:p>
     <w:p>
       <w:pPr>
-        <w:spacing w:after="80"/>
+        <w:spacing w:after="44"/>
       </w:pPr>
       <w:r>
         <w:rPr>
-          <w:rFonts w:ascii="Calibri" w:hAnsi="Calibri"/>
+          <w:rFonts w:ascii="Arial" w:hAnsi="Arial" w:eastAsia="Arial"/>
           <w:b/>
-          <w:color w:val="0F0C14"/>
-          <w:sz w:val="19"/>
+          <w:color w:val="0B0B0B"/>
+          <w:sz w:val="18"/>
         </w:rPr>
         <w:t xml:space="preserve">Pós-produção: </w:t>
       </w:r>
       <w:r>
         <w:rPr>
-          <w:rFonts w:ascii="Calibri" w:hAnsi="Calibri"/>
-          <w:color w:val="0F0C14"/>
-          <w:sz w:val="19"/>
+          <w:rFonts w:ascii="Arial" w:hAnsi="Arial" w:eastAsia="Arial"/>
+          <w:color w:val="0B0B0B"/>
+          <w:sz w:val="18"/>
         </w:rPr>
-        <w:t>DaVinci Resolve, Adobe Premiere Pro, CapCut, color grading e design de som</w:t>
+        <w:t>DaVinci Resolve, Adobe Premiere Pro, CapCut, color grading, design de som</w:t>
       </w:r>
     </w:p>
     <w:p>
       <w:pPr>
-        <w:spacing w:after="80"/>
+        <w:spacing w:after="44"/>
       </w:pPr>
       <w:r>
         <w:rPr>
-          <w:rFonts w:ascii="Calibri" w:hAnsi="Calibri"/>
+          <w:rFonts w:ascii="Arial" w:hAnsi="Arial" w:eastAsia="Arial"/>
           <w:b/>
-          <w:color w:val="0F0C14"/>
-          <w:sz w:val="19"/>
+          <w:color w:val="0B0B0B"/>
+          <w:sz w:val="18"/>
         </w:rPr>
         <w:t xml:space="preserve">IA e automação: </w:t>
       </w:r>
       <w:r>
         <w:rPr>
-          <w:rFonts w:ascii="Calibri" w:hAnsi="Calibri"/>
-          <w:color w:val="0F0C14"/>
-          <w:sz w:val="19"/>
+          <w:rFonts w:ascii="Arial" w:hAnsi="Arial" w:eastAsia="Arial"/>
+          <w:color w:val="0B0B0B"/>
+          <w:sz w:val="18"/>
         </w:rPr>
-        <w:t>Remotion, ffmpeg, transcrição, seleção de cortes e vídeo programático</w:t>
+        <w:t>Remotion, ffmpeg, transcrição, seleção de cortes, vídeo programático</w:t>
       </w:r>
     </w:p>
     <w:p>
       <w:pPr>
-        <w:keepNext/>
-        <w:spacing w:before="160" w:after="100"/>
-        <w:pBdr>
-          <w:bottom w:val="single" w:sz="8" w:space="5" w:color="FF4D35"/>
-        </w:pBdr>
+        <w:pStyle w:val="Heading1"/>
       </w:pPr>
       <w:r>
-        <w:rPr>
-          <w:rFonts w:ascii="Calibri" w:hAnsi="Calibri"/>
-          <w:b/>
-          <w:color w:val="0F0C14"/>
-          <w:sz w:val="20"/>
-        </w:rPr>
         <w:t>FORMAÇÃO</w:t>
       </w:r>
     </w:p>
     <w:p>
-      <w:pPr>
-        <w:spacing w:after="40"/>
-      </w:pPr>
       <w:r>
         <w:rPr>
-          <w:rFonts w:ascii="Calibri" w:hAnsi="Calibri"/>
+          <w:rFonts w:ascii="Arial" w:hAnsi="Arial" w:eastAsia="Arial"/>
           <w:b/>
-          <w:color w:val="0F0C14"/>
-          <w:sz w:val="20"/>
+          <w:color w:val="0B0B0B"/>
+          <w:sz w:val="18"/>
         </w:rPr>
         <w:t>Publicidade e Propaganda</w:t>
       </w:r>
       <w:r>
         <w:rPr>
-          <w:rFonts w:ascii="Calibri" w:hAnsi="Calibri"/>
-          <w:color w:val="585462"/>
-          <w:sz w:val="19"/>
+          <w:rFonts w:ascii="Arial" w:hAnsi="Arial" w:eastAsia="Arial"/>
+          <w:color w:val="0B0B0B"/>
+          <w:sz w:val="18"/>
         </w:rPr>
         <w:t xml:space="preserve"> | UniSALESIANO Araçatuba | Bacharelado em andamento, 8º período</w:t>
       </w:r>
     </w:p>
     <w:p>
       <w:pPr>
-        <w:keepNext/>
-        <w:spacing w:before="160" w:after="100"/>
-        <w:pBdr>
-          <w:bottom w:val="single" w:sz="8" w:space="5" w:color="FF4D35"/>
-        </w:pBdr>
+        <w:pStyle w:val="Heading1"/>
       </w:pPr>
       <w:r>
-        <w:rPr>
-          <w:rFonts w:ascii="Calibri" w:hAnsi="Calibri"/>
-          <w:b/>
-          <w:color w:val="0F0C14"/>
-          <w:sz w:val="20"/>
-        </w:rPr>
         <w:t>PORTFÓLIO SELECIONADO</w:t>
       </w:r>
     </w:p>
     <w:p>
       <w:r>
         <w:rPr>
-          <w:rFonts w:ascii="Calibri" w:hAnsi="Calibri"/>
-          <w:color w:val="0F0C14"/>
+          <w:rFonts w:ascii="Arial" w:hAnsi="Arial" w:eastAsia="Arial"/>
+          <w:b/>
+          <w:color w:val="0B0B0B"/>
           <w:sz w:val="18"/>
         </w:rPr>
-        <w:t>Portfólio geral: enzosmarinho.github.io | VOTI Software: youtube.com/@votigestao | Negócio Sem Filtro: instagram.com/onegociosemfiltro</w:t>
+        <w:t xml:space="preserve">Portfólio geral: </w:t>
       </w:r>
+      <w:hyperlink r:id="rId9">
+        <w:r>
+          <w:rPr>
+            <w:rFonts w:ascii="Arial" w:hAnsi="Arial"/>
+            <w:color w:val="0B0B0B"/>
+            <w:sz w:val="18"/>
+            <w:u w:val="single"/>
+          </w:rPr>
+          <w:t>enzosmarinho.github.io</w:t>
+        </w:r>
+      </w:hyperlink>
+      <w:r>
+        <w:rPr>
+          <w:rFonts w:ascii="Arial" w:hAnsi="Arial" w:eastAsia="Arial"/>
+          <w:b/>
+          <w:color w:val="0B0B0B"/>
+          <w:sz w:val="18"/>
+        </w:rPr>
+        <w:t xml:space="preserve"> | VOTI Software: </w:t>
+      </w:r>
+      <w:hyperlink r:id="rId11">
+        <w:r>
+          <w:rPr>
+            <w:rFonts w:ascii="Arial" w:hAnsi="Arial"/>
+            <w:color w:val="0B0B0B"/>
+            <w:sz w:val="18"/>
+            <w:u w:val="single"/>
+          </w:rPr>
+          <w:t>youtube.com/@votigestao</w:t>
+        </w:r>
+      </w:hyperlink>
+      <w:r>
+        <w:rPr>
+          <w:rFonts w:ascii="Arial" w:hAnsi="Arial" w:eastAsia="Arial"/>
+          <w:b/>
+          <w:color w:val="0B0B0B"/>
+          <w:sz w:val="18"/>
+        </w:rPr>
+        <w:t xml:space="preserve"> | Negócio Sem Filtro: </w:t>
+      </w:r>
+      <w:hyperlink r:id="rId12">
+        <w:r>
+          <w:rPr>
+            <w:rFonts w:ascii="Arial" w:hAnsi="Arial"/>
+            <w:color w:val="0B0B0B"/>
+            <w:sz w:val="18"/>
+            <w:u w:val="single"/>
+          </w:rPr>
+          <w:t>instagram.com/onegociosemfiltro</w:t>
+        </w:r>
+      </w:hyperlink>
     </w:p>
     <w:sectPr>
-      <w:footerReference w:type="default" r:id="rId9"/>
       <w:pgSz w:w="12240" w:h="15840"/>
-      <w:pgMar w:top="1181" w:right="1181" w:bottom="1181" w:left="1181" w:header="720" w:footer="720" w:gutter="0"/>
+      <w:pgMar w:top="1037" w:right="1037" w:bottom="1037" w:left="1037" w:header="432" w:footer="432" w:gutter="0"/>
       <w:cols w:space="720"/>
       <w:docGrid w:linePitch="360"/>
     </w:sectPr>
   </w:body>
 </w:document>
-</file>
-
-<file path=word/footer1.xml><?xml version="1.0" encoding="utf-8"?>
-<w:ftr xmlns:m="http://schemas.openxmlformats.org/officeDocument/2006/math" xmlns:mc="http://schemas.openxmlformats.org/markup-compatibility/2006" xmlns:mo="http://schemas.microsoft.com/office/mac/office/2008/main" xmlns:mv="urn:schemas-microsoft-com:mac:vml" xmlns:o="urn:schemas-microsoft-com:office:office" xmlns:r="http://schemas.openxmlformats.org/officeDocument/2006/relationships" xmlns:v="urn:schemas-microsoft-com:vml" xmlns:w10="urn:schemas-microsoft-com:office:word" xmlns:w14="http://schemas.microsoft.com/office/word/2010/wordml" xmlns:w="http://schemas.openxmlformats.org/wordprocessingml/2006/main" xmlns:wne="http://schemas.microsoft.com/office/word/2006/wordml" xmlns:wp14="http://schemas.microsoft.com/office/word/2010/wordprocessingDrawing" xmlns:wp="http://schemas.openxmlformats.org/drawingml/2006/wordprocessingDrawing" xmlns:wpc="http://schemas.microsoft.com/office/word/2010/wordprocessingCanvas" xmlns:wpg="http://schemas.microsoft.com/office/word/2010/wordprocessingGroup" xmlns:wpi="http://schemas.microsoft.com/office/word/2010/wordprocessingInk" xmlns:wps="http://schemas.microsoft.com/office/word/2010/wordprocessingShape" mc:Ignorable="w14 wp14">
-  <w:p>
-    <w:pPr>
-      <w:pStyle w:val="Footer"/>
-      <w:jc w:val="center"/>
-    </w:pPr>
-    <w:r>
-      <w:rPr>
-        <w:rFonts w:ascii="Calibri" w:hAnsi="Calibri"/>
-        <w:color w:val="585462"/>
-        <w:sz w:val="16"/>
-      </w:rPr>
-      <w:t>Enzo Marinho | Portfólio: enzosmarinho.github.io</w:t>
-    </w:r>
-  </w:p>
-</w:ftr>
 </file>
 
 <file path=word/numbering.xml><?xml version="1.0" encoding="utf-8"?>
@@ -693,6 +749,27 @@
   </w:num>
   <w:num w:numId="9">
     <w:abstractNumId w:val="0"/>
+  </w:num>
+  <w:abstractNum w:abstractNumId="9">
+    <w:multiLevelType w:val="singleLevel"/>
+    <w:lvl w:ilvl="0">
+      <w:start w:val="1"/>
+      <w:numFmt w:val="bullet"/>
+      <w:lvlText w:val="•"/>
+      <w:lvlJc w:val="left"/>
+      <w:pPr>
+        <w:tabs>
+          <w:tab w:val="num" w:pos="360"/>
+        </w:tabs>
+        <w:ind w:left="360" w:hanging="180"/>
+      </w:pPr>
+      <w:rPr>
+        <w:rFonts w:ascii="Arial" w:hAnsi="Arial"/>
+      </w:rPr>
+    </w:lvl>
+  </w:abstractNum>
+  <w:num w:numId="10">
+    <w:abstractNumId w:val="9"/>
   </w:num>
 </w:numbering>
 </file>
@@ -858,12 +935,12 @@
     <w:qFormat/>
     <w:rsid w:val="00FC693F"/>
     <w:pPr>
-      <w:spacing w:before="0" w:after="80" w:line="259" w:lineRule="auto"/>
+      <w:spacing w:before="0" w:after="76" w:line="259" w:lineRule="auto"/>
     </w:pPr>
     <w:rPr>
-      <w:rFonts w:ascii="Calibri" w:hAnsi="Calibri"/>
-      <w:color w:val="0F0C14"/>
-      <w:sz w:val="21"/>
+      <w:rFonts w:ascii="Arial" w:hAnsi="Arial"/>
+      <w:color w:val="0B0B0B"/>
+      <w:sz w:val="18"/>
     </w:rPr>
   </w:style>
   <w:style w:type="paragraph" w:styleId="Header">
@@ -921,15 +998,15 @@
     <w:pPr>
       <w:keepNext/>
       <w:keepLines/>
-      <w:spacing w:before="320" w:after="160"/>
+      <w:spacing w:before="140" w:after="64"/>
       <w:outlineLvl w:val="0"/>
     </w:pPr>
     <w:rPr>
-      <w:rFonts w:asciiTheme="majorHAnsi" w:eastAsiaTheme="majorEastAsia" w:hAnsiTheme="majorHAnsi" w:cstheme="majorBidi" w:ascii="Calibri" w:hAnsi="Calibri"/>
+      <w:rFonts w:asciiTheme="majorHAnsi" w:eastAsiaTheme="majorEastAsia" w:hAnsiTheme="majorHAnsi" w:cstheme="majorBidi" w:ascii="Consolas" w:hAnsi="Consolas"/>
       <w:b/>
       <w:bCs/>
-      <w:color w:val="0F0C14"/>
-      <w:sz w:val="32"/>
+      <w:color w:val="0B0B0B"/>
+      <w:sz w:val="20"/>
       <w:szCs w:val="28"/>
     </w:rPr>
   </w:style>
@@ -945,14 +1022,14 @@
     <w:pPr>
       <w:keepNext/>
       <w:keepLines/>
-      <w:spacing w:before="240" w:after="120"/>
+      <w:spacing w:before="200" w:after="0"/>
       <w:outlineLvl w:val="1"/>
     </w:pPr>
     <w:rPr>
-      <w:rFonts w:asciiTheme="majorHAnsi" w:eastAsiaTheme="majorEastAsia" w:hAnsiTheme="majorHAnsi" w:cstheme="majorBidi" w:ascii="Calibri" w:hAnsi="Calibri"/>
+      <w:rFonts w:asciiTheme="majorHAnsi" w:eastAsiaTheme="majorEastAsia" w:hAnsiTheme="majorHAnsi" w:cstheme="majorBidi"/>
       <w:b/>
       <w:bCs/>
-      <w:color w:val="0F0C14"/>
+      <w:color w:val="4F81BD" w:themeColor="accent1"/>
       <w:sz w:val="26"/>
       <w:szCs w:val="26"/>
     </w:rPr>
@@ -969,15 +1046,14 @@
     <w:pPr>
       <w:keepNext/>
       <w:keepLines/>
-      <w:spacing w:before="160" w:after="80"/>
+      <w:spacing w:before="200" w:after="0"/>
       <w:outlineLvl w:val="2"/>
     </w:pPr>
     <w:rPr>
-      <w:rFonts w:asciiTheme="majorHAnsi" w:eastAsiaTheme="majorEastAsia" w:hAnsiTheme="majorHAnsi" w:cstheme="majorBidi" w:ascii="Calibri" w:hAnsi="Calibri"/>
+      <w:rFonts w:asciiTheme="majorHAnsi" w:eastAsiaTheme="majorEastAsia" w:hAnsiTheme="majorHAnsi" w:cstheme="majorBidi"/>
       <w:b/>
       <w:bCs/>
-      <w:color w:val="0F0C14"/>
-      <w:sz w:val="24"/>
+      <w:color w:val="4F81BD" w:themeColor="accent1"/>
     </w:rPr>
   </w:style>
   <w:style w:type="paragraph" w:styleId="Heading4">

</xml_diff>

<commit_message>
Turn hero into a full-bleed real-media showcase
</commit_message>
<xml_diff>
--- a/assets/Enzo-Marinho-Curriculo-ATS.docx
+++ b/assets/Enzo-Marinho-Curriculo-ATS.docx
@@ -40,7 +40,7 @@
           <w:color w:val="0B0B0B"/>
           <w:sz w:val="17"/>
         </w:rPr>
-        <w:t xml:space="preserve">Araçatuba/SP | (18) 98119-6746 | enzo.marinho@hotmail.com | </w:t>
+        <w:t xml:space="preserve">Araçatuba/SP | (18) 98119-6746 | enzosmarinho@hotmail.com | </w:t>
       </w:r>
       <w:hyperlink r:id="rId9">
         <w:r>
@@ -130,7 +130,7 @@
           <w:color w:val="0B0B0B"/>
           <w:sz w:val="18"/>
         </w:rPr>
-        <w:t>Negócio Sem Filtro: edição do vídeo longo, de todos os cortes e teasers publicados, incluindo seleção e ranking de trechos.</w:t>
+        <w:t>Negócio Sem Filtro: produção dos cortes e teasers publicados, com seleção e ranking de trechos, além da captação em um episódio long-form.</w:t>
       </w:r>
     </w:p>
     <w:p>
@@ -310,7 +310,7 @@
           <w:color w:val="0B0B0B"/>
           <w:sz w:val="18"/>
         </w:rPr>
-        <w:t>Negócio Sem Filtro: edição long-form, cortes, teasers e curadoria de trechos apoiada por IA.</w:t>
+        <w:t>Negócio Sem Filtro: cortes, teasers, curadoria de trechos apoiada por IA e captação em um episódio long-form.</w:t>
       </w:r>
     </w:p>
     <w:p>

</xml_diff>